<commit_message>
Synchronisation vom 29.09.2026 20:30:57,27
</commit_message>
<xml_diff>
--- a/Berichtsvorlagen/Mitgeliefert/Berichtsvorlage_Baukasten.docx
+++ b/Berichtsvorlagen/Mitgeliefert/Berichtsvorlage_Baukasten.docx
@@ -15,7 +15,7 @@
         <w:pStyle w:val="Normal"/>
       </w:pPr>
       <w:r>
-        <w:t xml:space="preserve">Jeder Platzhalter des Katalogs (Fassung 6, 1304 Einträge) mit seiner Beschreibung, gegliedert nach Kontext. Absätze lassen sich in eine eigene Vorlage kopieren: Text, Zahl und Datum stehen im Satz, Tabellen, Listen und Kapitel allein im Absatz, Bilder tragen den Schlüssel im Alternativtext, Schalter stehen in Bedingungen. Statt getippt kann ein Schlüssel auch als Tag eines Inhaltssteuerelements stehen. Gefüllt wird der Baukasten ein Probebericht mit jedem Wert.</w:t>
+        <w:t xml:space="preserve">Jeder Platzhalter des Katalogs (Fassung 10, 1336 Einträge) mit seiner Beschreibung, gegliedert nach Kontext. Absätze lassen sich in eine eigene Vorlage kopieren: Text, Zahl und Datum stehen im Satz, Tabellen, Listen und Kapitel allein im Absatz, Bilder tragen den Schlüssel im Alternativtext, Schalter stehen in Bedingungen. Statt getippt kann ein Schlüssel auch als Tag eines Inhaltssteuerelements stehen. Gefüllt wird der Baukasten ein Probebericht mit jedem Wert.</w:t>
       </w:r>
     </w:p>
     <w:p>
@@ -27702,6 +27702,766 @@
     </w:p>
     <w:p>
       <w:pPr>
+        <w:pStyle w:val="Hinweis"/>
+        <w:keepNext/>
+      </w:pPr>
+      <w:r>
+        <w:t xml:space="preserve">Bildschalter: Gibt es das Bild „Wärmelast im Jahresverlauf“ (Stand bzw. irgendein Stand)? · </w:t>
+      </w:r>
+      <w:r>
+        <w:rPr>
+          <w:noProof/>
+          <w:color w:val="7F7F7F"/>
+        </w:rPr>
+        <w:t xml:space="preserve">hat.bild.bedarf_waerme</w:t>
+      </w:r>
+    </w:p>
+    <w:p>
+      <w:pPr>
+        <w:pStyle w:val="Normal"/>
+      </w:pPr>
+      <w:r>
+        <w:rPr>
+          <w:noProof/>
+        </w:rPr>
+        <w:t xml:space="preserve">{{#wenn hat.bild.bedarf_waerme}}</w:t>
+      </w:r>
+    </w:p>
+    <w:p>
+      <w:pPr>
+        <w:pStyle w:val="Normal"/>
+      </w:pPr>
+      <w:r>
+        <w:t xml:space="preserve">Bildschalter: Gibt es das Bild „Wärmelast im Jahresverlauf“ (Stand bzw. irgendein Stand)?: trifft zu</w:t>
+      </w:r>
+    </w:p>
+    <w:p>
+      <w:pPr>
+        <w:pStyle w:val="Normal"/>
+      </w:pPr>
+      <w:r>
+        <w:rPr>
+          <w:noProof/>
+        </w:rPr>
+        <w:t xml:space="preserve">{{/wenn}}</w:t>
+      </w:r>
+    </w:p>
+    <w:p>
+      <w:pPr>
+        <w:pStyle w:val="Normal"/>
+      </w:pPr>
+      <w:r>
+        <w:rPr>
+          <w:noProof/>
+        </w:rPr>
+        <w:t xml:space="preserve">{{#wenn nicht hat.bild.bedarf_waerme}}</w:t>
+      </w:r>
+    </w:p>
+    <w:p>
+      <w:pPr>
+        <w:pStyle w:val="Normal"/>
+      </w:pPr>
+      <w:r>
+        <w:t xml:space="preserve">Bildschalter: Gibt es das Bild „Wärmelast im Jahresverlauf“ (Stand bzw. irgendein Stand)?: trifft nicht zu</w:t>
+      </w:r>
+    </w:p>
+    <w:p>
+      <w:pPr>
+        <w:pStyle w:val="Normal"/>
+      </w:pPr>
+      <w:r>
+        <w:rPr>
+          <w:noProof/>
+        </w:rPr>
+        <w:t xml:space="preserve">{{/wenn}}</w:t>
+      </w:r>
+    </w:p>
+    <w:p>
+      <w:pPr>
+        <w:pStyle w:val="Hinweis"/>
+        <w:keepNext/>
+      </w:pPr>
+      <w:r>
+        <w:t xml:space="preserve">Bildschalter: Gibt es das Bild „Strombedarf im Jahresverlauf“ (Stand bzw. irgendein Stand)? · </w:t>
+      </w:r>
+      <w:r>
+        <w:rPr>
+          <w:noProof/>
+          <w:color w:val="7F7F7F"/>
+        </w:rPr>
+        <w:t xml:space="preserve">hat.bild.bedarf_strom</w:t>
+      </w:r>
+    </w:p>
+    <w:p>
+      <w:pPr>
+        <w:pStyle w:val="Normal"/>
+      </w:pPr>
+      <w:r>
+        <w:rPr>
+          <w:noProof/>
+        </w:rPr>
+        <w:t xml:space="preserve">{{#wenn hat.bild.bedarf_strom}}</w:t>
+      </w:r>
+    </w:p>
+    <w:p>
+      <w:pPr>
+        <w:pStyle w:val="Normal"/>
+      </w:pPr>
+      <w:r>
+        <w:t xml:space="preserve">Bildschalter: Gibt es das Bild „Strombedarf im Jahresverlauf“ (Stand bzw. irgendein Stand)?: trifft zu</w:t>
+      </w:r>
+    </w:p>
+    <w:p>
+      <w:pPr>
+        <w:pStyle w:val="Normal"/>
+      </w:pPr>
+      <w:r>
+        <w:rPr>
+          <w:noProof/>
+        </w:rPr>
+        <w:t xml:space="preserve">{{/wenn}}</w:t>
+      </w:r>
+    </w:p>
+    <w:p>
+      <w:pPr>
+        <w:pStyle w:val="Normal"/>
+      </w:pPr>
+      <w:r>
+        <w:rPr>
+          <w:noProof/>
+        </w:rPr>
+        <w:t xml:space="preserve">{{#wenn nicht hat.bild.bedarf_strom}}</w:t>
+      </w:r>
+    </w:p>
+    <w:p>
+      <w:pPr>
+        <w:pStyle w:val="Normal"/>
+      </w:pPr>
+      <w:r>
+        <w:t xml:space="preserve">Bildschalter: Gibt es das Bild „Strombedarf im Jahresverlauf“ (Stand bzw. irgendein Stand)?: trifft nicht zu</w:t>
+      </w:r>
+    </w:p>
+    <w:p>
+      <w:pPr>
+        <w:pStyle w:val="Normal"/>
+      </w:pPr>
+      <w:r>
+        <w:rPr>
+          <w:noProof/>
+        </w:rPr>
+        <w:t xml:space="preserve">{{/wenn}}</w:t>
+      </w:r>
+    </w:p>
+    <w:p>
+      <w:pPr>
+        <w:pStyle w:val="Hinweis"/>
+        <w:keepNext/>
+      </w:pPr>
+      <w:r>
+        <w:t xml:space="preserve">Bildschalter: Gibt es das Bild „Kältelast im Jahresverlauf“ (Stand bzw. irgendein Stand)? · </w:t>
+      </w:r>
+      <w:r>
+        <w:rPr>
+          <w:noProof/>
+          <w:color w:val="7F7F7F"/>
+        </w:rPr>
+        <w:t xml:space="preserve">hat.bild.bedarf_kaelte</w:t>
+      </w:r>
+    </w:p>
+    <w:p>
+      <w:pPr>
+        <w:pStyle w:val="Normal"/>
+      </w:pPr>
+      <w:r>
+        <w:rPr>
+          <w:noProof/>
+        </w:rPr>
+        <w:t xml:space="preserve">{{#wenn hat.bild.bedarf_kaelte}}</w:t>
+      </w:r>
+    </w:p>
+    <w:p>
+      <w:pPr>
+        <w:pStyle w:val="Normal"/>
+      </w:pPr>
+      <w:r>
+        <w:t xml:space="preserve">Bildschalter: Gibt es das Bild „Kältelast im Jahresverlauf“ (Stand bzw. irgendein Stand)?: trifft zu</w:t>
+      </w:r>
+    </w:p>
+    <w:p>
+      <w:pPr>
+        <w:pStyle w:val="Normal"/>
+      </w:pPr>
+      <w:r>
+        <w:rPr>
+          <w:noProof/>
+        </w:rPr>
+        <w:t xml:space="preserve">{{/wenn}}</w:t>
+      </w:r>
+    </w:p>
+    <w:p>
+      <w:pPr>
+        <w:pStyle w:val="Normal"/>
+      </w:pPr>
+      <w:r>
+        <w:rPr>
+          <w:noProof/>
+        </w:rPr>
+        <w:t xml:space="preserve">{{#wenn nicht hat.bild.bedarf_kaelte}}</w:t>
+      </w:r>
+    </w:p>
+    <w:p>
+      <w:pPr>
+        <w:pStyle w:val="Normal"/>
+      </w:pPr>
+      <w:r>
+        <w:t xml:space="preserve">Bildschalter: Gibt es das Bild „Kältelast im Jahresverlauf“ (Stand bzw. irgendein Stand)?: trifft nicht zu</w:t>
+      </w:r>
+    </w:p>
+    <w:p>
+      <w:pPr>
+        <w:pStyle w:val="Normal"/>
+      </w:pPr>
+      <w:r>
+        <w:rPr>
+          <w:noProof/>
+        </w:rPr>
+        <w:t xml:space="preserve">{{/wenn}}</w:t>
+      </w:r>
+    </w:p>
+    <w:p>
+      <w:pPr>
+        <w:pStyle w:val="Hinweis"/>
+        <w:keepNext/>
+      </w:pPr>
+      <w:r>
+        <w:t xml:space="preserve">Bildschalter: Gibt es das Bild der Wärmepumpe (Stand bzw. irgendein Stand)? · </w:t>
+      </w:r>
+      <w:r>
+        <w:rPr>
+          <w:noProof/>
+          <w:color w:val="7F7F7F"/>
+        </w:rPr>
+        <w:t xml:space="preserve">hat.bild.waermepumpe</w:t>
+      </w:r>
+    </w:p>
+    <w:p>
+      <w:pPr>
+        <w:pStyle w:val="Normal"/>
+      </w:pPr>
+      <w:r>
+        <w:rPr>
+          <w:noProof/>
+        </w:rPr>
+        <w:t xml:space="preserve">{{#wenn hat.bild.waermepumpe}}</w:t>
+      </w:r>
+    </w:p>
+    <w:p>
+      <w:pPr>
+        <w:pStyle w:val="Normal"/>
+      </w:pPr>
+      <w:r>
+        <w:t xml:space="preserve">Bildschalter: Gibt es das Bild der Wärmepumpe (Stand bzw. irgendein Stand)?: trifft zu</w:t>
+      </w:r>
+    </w:p>
+    <w:p>
+      <w:pPr>
+        <w:pStyle w:val="Normal"/>
+      </w:pPr>
+      <w:r>
+        <w:rPr>
+          <w:noProof/>
+        </w:rPr>
+        <w:t xml:space="preserve">{{/wenn}}</w:t>
+      </w:r>
+    </w:p>
+    <w:p>
+      <w:pPr>
+        <w:pStyle w:val="Normal"/>
+      </w:pPr>
+      <w:r>
+        <w:rPr>
+          <w:noProof/>
+        </w:rPr>
+        <w:t xml:space="preserve">{{#wenn nicht hat.bild.waermepumpe}}</w:t>
+      </w:r>
+    </w:p>
+    <w:p>
+      <w:pPr>
+        <w:pStyle w:val="Normal"/>
+      </w:pPr>
+      <w:r>
+        <w:t xml:space="preserve">Bildschalter: Gibt es das Bild der Wärmepumpe (Stand bzw. irgendein Stand)?: trifft nicht zu</w:t>
+      </w:r>
+    </w:p>
+    <w:p>
+      <w:pPr>
+        <w:pStyle w:val="Normal"/>
+      </w:pPr>
+      <w:r>
+        <w:rPr>
+          <w:noProof/>
+        </w:rPr>
+        <w:t xml:space="preserve">{{/wenn}}</w:t>
+      </w:r>
+    </w:p>
+    <w:p>
+      <w:pPr>
+        <w:pStyle w:val="Hinweis"/>
+        <w:keepNext/>
+      </w:pPr>
+      <w:r>
+        <w:t xml:space="preserve">Bildschalter: Gibt es das Bild „Stromverbrauch der Wärmepumpe“ (Stand bzw. irgendein Stand)? · </w:t>
+      </w:r>
+      <w:r>
+        <w:rPr>
+          <w:noProof/>
+          <w:color w:val="7F7F7F"/>
+        </w:rPr>
+        <w:t xml:space="preserve">hat.bild.waermepumpe_strom</w:t>
+      </w:r>
+    </w:p>
+    <w:p>
+      <w:pPr>
+        <w:pStyle w:val="Normal"/>
+      </w:pPr>
+      <w:r>
+        <w:rPr>
+          <w:noProof/>
+        </w:rPr>
+        <w:t xml:space="preserve">{{#wenn hat.bild.waermepumpe_strom}}</w:t>
+      </w:r>
+    </w:p>
+    <w:p>
+      <w:pPr>
+        <w:pStyle w:val="Normal"/>
+      </w:pPr>
+      <w:r>
+        <w:t xml:space="preserve">Bildschalter: Gibt es das Bild „Stromverbrauch der Wärmepumpe“ (Stand bzw. irgendein Stand)?: trifft zu</w:t>
+      </w:r>
+    </w:p>
+    <w:p>
+      <w:pPr>
+        <w:pStyle w:val="Normal"/>
+      </w:pPr>
+      <w:r>
+        <w:rPr>
+          <w:noProof/>
+        </w:rPr>
+        <w:t xml:space="preserve">{{/wenn}}</w:t>
+      </w:r>
+    </w:p>
+    <w:p>
+      <w:pPr>
+        <w:pStyle w:val="Normal"/>
+      </w:pPr>
+      <w:r>
+        <w:rPr>
+          <w:noProof/>
+        </w:rPr>
+        <w:t xml:space="preserve">{{#wenn nicht hat.bild.waermepumpe_strom}}</w:t>
+      </w:r>
+    </w:p>
+    <w:p>
+      <w:pPr>
+        <w:pStyle w:val="Normal"/>
+      </w:pPr>
+      <w:r>
+        <w:t xml:space="preserve">Bildschalter: Gibt es das Bild „Stromverbrauch der Wärmepumpe“ (Stand bzw. irgendein Stand)?: trifft nicht zu</w:t>
+      </w:r>
+    </w:p>
+    <w:p>
+      <w:pPr>
+        <w:pStyle w:val="Normal"/>
+      </w:pPr>
+      <w:r>
+        <w:rPr>
+          <w:noProof/>
+        </w:rPr>
+        <w:t xml:space="preserve">{{/wenn}}</w:t>
+      </w:r>
+    </w:p>
+    <w:p>
+      <w:pPr>
+        <w:pStyle w:val="Hinweis"/>
+        <w:keepNext/>
+      </w:pPr>
+      <w:r>
+        <w:t xml:space="preserve">Bildschalter: Gibt es das Bild „Leistung über Außentemperatur“ (Stand bzw. irgendein Stand)? · </w:t>
+      </w:r>
+      <w:r>
+        <w:rPr>
+          <w:noProof/>
+          <w:color w:val="7F7F7F"/>
+        </w:rPr>
+        <w:t xml:space="preserve">hat.bild.waermepumpe_streuwolke</w:t>
+      </w:r>
+    </w:p>
+    <w:p>
+      <w:pPr>
+        <w:pStyle w:val="Normal"/>
+      </w:pPr>
+      <w:r>
+        <w:rPr>
+          <w:noProof/>
+        </w:rPr>
+        <w:t xml:space="preserve">{{#wenn hat.bild.waermepumpe_streuwolke}}</w:t>
+      </w:r>
+    </w:p>
+    <w:p>
+      <w:pPr>
+        <w:pStyle w:val="Normal"/>
+      </w:pPr>
+      <w:r>
+        <w:t xml:space="preserve">Bildschalter: Gibt es das Bild „Leistung über Außentemperatur“ (Stand bzw. irgendein Stand)?: trifft zu</w:t>
+      </w:r>
+    </w:p>
+    <w:p>
+      <w:pPr>
+        <w:pStyle w:val="Normal"/>
+      </w:pPr>
+      <w:r>
+        <w:rPr>
+          <w:noProof/>
+        </w:rPr>
+        <w:t xml:space="preserve">{{/wenn}}</w:t>
+      </w:r>
+    </w:p>
+    <w:p>
+      <w:pPr>
+        <w:pStyle w:val="Normal"/>
+      </w:pPr>
+      <w:r>
+        <w:rPr>
+          <w:noProof/>
+        </w:rPr>
+        <w:t xml:space="preserve">{{#wenn nicht hat.bild.waermepumpe_streuwolke}}</w:t>
+      </w:r>
+    </w:p>
+    <w:p>
+      <w:pPr>
+        <w:pStyle w:val="Normal"/>
+      </w:pPr>
+      <w:r>
+        <w:t xml:space="preserve">Bildschalter: Gibt es das Bild „Leistung über Außentemperatur“ (Stand bzw. irgendein Stand)?: trifft nicht zu</w:t>
+      </w:r>
+    </w:p>
+    <w:p>
+      <w:pPr>
+        <w:pStyle w:val="Normal"/>
+      </w:pPr>
+      <w:r>
+        <w:rPr>
+          <w:noProof/>
+        </w:rPr>
+        <w:t xml:space="preserve">{{/wenn}}</w:t>
+      </w:r>
+    </w:p>
+    <w:p>
+      <w:pPr>
+        <w:pStyle w:val="Hinweis"/>
+        <w:keepNext/>
+      </w:pPr>
+      <w:r>
+        <w:t xml:space="preserve">Bildschalter: Gibt es das Bild der Heizkessel (Stand bzw. irgendein Stand)? · </w:t>
+      </w:r>
+      <w:r>
+        <w:rPr>
+          <w:noProof/>
+          <w:color w:val="7F7F7F"/>
+        </w:rPr>
+        <w:t xml:space="preserve">hat.bild.heizkessel</w:t>
+      </w:r>
+    </w:p>
+    <w:p>
+      <w:pPr>
+        <w:pStyle w:val="Normal"/>
+      </w:pPr>
+      <w:r>
+        <w:rPr>
+          <w:noProof/>
+        </w:rPr>
+        <w:t xml:space="preserve">{{#wenn hat.bild.heizkessel}}</w:t>
+      </w:r>
+    </w:p>
+    <w:p>
+      <w:pPr>
+        <w:pStyle w:val="Normal"/>
+      </w:pPr>
+      <w:r>
+        <w:t xml:space="preserve">Bildschalter: Gibt es das Bild der Heizkessel (Stand bzw. irgendein Stand)?: trifft zu</w:t>
+      </w:r>
+    </w:p>
+    <w:p>
+      <w:pPr>
+        <w:pStyle w:val="Normal"/>
+      </w:pPr>
+      <w:r>
+        <w:rPr>
+          <w:noProof/>
+        </w:rPr>
+        <w:t xml:space="preserve">{{/wenn}}</w:t>
+      </w:r>
+    </w:p>
+    <w:p>
+      <w:pPr>
+        <w:pStyle w:val="Normal"/>
+      </w:pPr>
+      <w:r>
+        <w:rPr>
+          <w:noProof/>
+        </w:rPr>
+        <w:t xml:space="preserve">{{#wenn nicht hat.bild.heizkessel}}</w:t>
+      </w:r>
+    </w:p>
+    <w:p>
+      <w:pPr>
+        <w:pStyle w:val="Normal"/>
+      </w:pPr>
+      <w:r>
+        <w:t xml:space="preserve">Bildschalter: Gibt es das Bild der Heizkessel (Stand bzw. irgendein Stand)?: trifft nicht zu</w:t>
+      </w:r>
+    </w:p>
+    <w:p>
+      <w:pPr>
+        <w:pStyle w:val="Normal"/>
+      </w:pPr>
+      <w:r>
+        <w:rPr>
+          <w:noProof/>
+        </w:rPr>
+        <w:t xml:space="preserve">{{/wenn}}</w:t>
+      </w:r>
+    </w:p>
+    <w:p>
+      <w:pPr>
+        <w:pStyle w:val="Hinweis"/>
+        <w:keepNext/>
+      </w:pPr>
+      <w:r>
+        <w:t xml:space="preserve">Bildschalter: Gibt es das Bild der Solarthermie (Stand bzw. irgendein Stand)? · </w:t>
+      </w:r>
+      <w:r>
+        <w:rPr>
+          <w:noProof/>
+          <w:color w:val="7F7F7F"/>
+        </w:rPr>
+        <w:t xml:space="preserve">hat.bild.solarthermie</w:t>
+      </w:r>
+    </w:p>
+    <w:p>
+      <w:pPr>
+        <w:pStyle w:val="Normal"/>
+      </w:pPr>
+      <w:r>
+        <w:rPr>
+          <w:noProof/>
+        </w:rPr>
+        <w:t xml:space="preserve">{{#wenn hat.bild.solarthermie}}</w:t>
+      </w:r>
+    </w:p>
+    <w:p>
+      <w:pPr>
+        <w:pStyle w:val="Normal"/>
+      </w:pPr>
+      <w:r>
+        <w:t xml:space="preserve">Bildschalter: Gibt es das Bild der Solarthermie (Stand bzw. irgendein Stand)?: trifft zu</w:t>
+      </w:r>
+    </w:p>
+    <w:p>
+      <w:pPr>
+        <w:pStyle w:val="Normal"/>
+      </w:pPr>
+      <w:r>
+        <w:rPr>
+          <w:noProof/>
+        </w:rPr>
+        <w:t xml:space="preserve">{{/wenn}}</w:t>
+      </w:r>
+    </w:p>
+    <w:p>
+      <w:pPr>
+        <w:pStyle w:val="Normal"/>
+      </w:pPr>
+      <w:r>
+        <w:rPr>
+          <w:noProof/>
+        </w:rPr>
+        <w:t xml:space="preserve">{{#wenn nicht hat.bild.solarthermie}}</w:t>
+      </w:r>
+    </w:p>
+    <w:p>
+      <w:pPr>
+        <w:pStyle w:val="Normal"/>
+      </w:pPr>
+      <w:r>
+        <w:t xml:space="preserve">Bildschalter: Gibt es das Bild der Solarthermie (Stand bzw. irgendein Stand)?: trifft nicht zu</w:t>
+      </w:r>
+    </w:p>
+    <w:p>
+      <w:pPr>
+        <w:pStyle w:val="Normal"/>
+      </w:pPr>
+      <w:r>
+        <w:rPr>
+          <w:noProof/>
+        </w:rPr>
+        <w:t xml:space="preserve">{{/wenn}}</w:t>
+      </w:r>
+    </w:p>
+    <w:p>
+      <w:pPr>
+        <w:pStyle w:val="Hinweis"/>
+        <w:keepNext/>
+      </w:pPr>
+      <w:r>
+        <w:t xml:space="preserve">Bildschalter: Gibt es das Bild des BHKW (Stand bzw. irgendein Stand)? · </w:t>
+      </w:r>
+      <w:r>
+        <w:rPr>
+          <w:noProof/>
+          <w:color w:val="7F7F7F"/>
+        </w:rPr>
+        <w:t xml:space="preserve">hat.bild.bhkw</w:t>
+      </w:r>
+    </w:p>
+    <w:p>
+      <w:pPr>
+        <w:pStyle w:val="Normal"/>
+      </w:pPr>
+      <w:r>
+        <w:rPr>
+          <w:noProof/>
+        </w:rPr>
+        <w:t xml:space="preserve">{{#wenn hat.bild.bhkw}}</w:t>
+      </w:r>
+    </w:p>
+    <w:p>
+      <w:pPr>
+        <w:pStyle w:val="Normal"/>
+      </w:pPr>
+      <w:r>
+        <w:t xml:space="preserve">Bildschalter: Gibt es das Bild des BHKW (Stand bzw. irgendein Stand)?: trifft zu</w:t>
+      </w:r>
+    </w:p>
+    <w:p>
+      <w:pPr>
+        <w:pStyle w:val="Normal"/>
+      </w:pPr>
+      <w:r>
+        <w:rPr>
+          <w:noProof/>
+        </w:rPr>
+        <w:t xml:space="preserve">{{/wenn}}</w:t>
+      </w:r>
+    </w:p>
+    <w:p>
+      <w:pPr>
+        <w:pStyle w:val="Normal"/>
+      </w:pPr>
+      <w:r>
+        <w:rPr>
+          <w:noProof/>
+        </w:rPr>
+        <w:t xml:space="preserve">{{#wenn nicht hat.bild.bhkw}}</w:t>
+      </w:r>
+    </w:p>
+    <w:p>
+      <w:pPr>
+        <w:pStyle w:val="Normal"/>
+      </w:pPr>
+      <w:r>
+        <w:t xml:space="preserve">Bildschalter: Gibt es das Bild des BHKW (Stand bzw. irgendein Stand)?: trifft nicht zu</w:t>
+      </w:r>
+    </w:p>
+    <w:p>
+      <w:pPr>
+        <w:pStyle w:val="Normal"/>
+      </w:pPr>
+      <w:r>
+        <w:rPr>
+          <w:noProof/>
+        </w:rPr>
+        <w:t xml:space="preserve">{{/wenn}}</w:t>
+      </w:r>
+    </w:p>
+    <w:p>
+      <w:pPr>
+        <w:pStyle w:val="Hinweis"/>
+        <w:keepNext/>
+      </w:pPr>
+      <w:r>
+        <w:t xml:space="preserve">Bildschalter: Gibt es das Bild der Photovoltaik (Stand bzw. irgendein Stand)? · </w:t>
+      </w:r>
+      <w:r>
+        <w:rPr>
+          <w:noProof/>
+          <w:color w:val="7F7F7F"/>
+        </w:rPr>
+        <w:t xml:space="preserve">hat.bild.photovoltaik</w:t>
+      </w:r>
+    </w:p>
+    <w:p>
+      <w:pPr>
+        <w:pStyle w:val="Normal"/>
+      </w:pPr>
+      <w:r>
+        <w:rPr>
+          <w:noProof/>
+        </w:rPr>
+        <w:t xml:space="preserve">{{#wenn hat.bild.photovoltaik}}</w:t>
+      </w:r>
+    </w:p>
+    <w:p>
+      <w:pPr>
+        <w:pStyle w:val="Normal"/>
+      </w:pPr>
+      <w:r>
+        <w:t xml:space="preserve">Bildschalter: Gibt es das Bild der Photovoltaik (Stand bzw. irgendein Stand)?: trifft zu</w:t>
+      </w:r>
+    </w:p>
+    <w:p>
+      <w:pPr>
+        <w:pStyle w:val="Normal"/>
+      </w:pPr>
+      <w:r>
+        <w:rPr>
+          <w:noProof/>
+        </w:rPr>
+        <w:t xml:space="preserve">{{/wenn}}</w:t>
+      </w:r>
+    </w:p>
+    <w:p>
+      <w:pPr>
+        <w:pStyle w:val="Normal"/>
+      </w:pPr>
+      <w:r>
+        <w:rPr>
+          <w:noProof/>
+        </w:rPr>
+        <w:t xml:space="preserve">{{#wenn nicht hat.bild.photovoltaik}}</w:t>
+      </w:r>
+    </w:p>
+    <w:p>
+      <w:pPr>
+        <w:pStyle w:val="Normal"/>
+      </w:pPr>
+      <w:r>
+        <w:t xml:space="preserve">Bildschalter: Gibt es das Bild der Photovoltaik (Stand bzw. irgendein Stand)?: trifft nicht zu</w:t>
+      </w:r>
+    </w:p>
+    <w:p>
+      <w:pPr>
+        <w:pStyle w:val="Normal"/>
+      </w:pPr>
+      <w:r>
+        <w:rPr>
+          <w:noProof/>
+        </w:rPr>
+        <w:t xml:space="preserve">{{/wenn}}</w:t>
+      </w:r>
+    </w:p>
+    <w:p>
+      <w:pPr>
         <w:pStyle w:val="Heading1"/>
       </w:pPr>
       <w:r>
@@ -30637,6 +31397,60 @@
     </w:p>
     <w:p>
       <w:pPr>
+        <w:pStyle w:val="Hinweis"/>
+        <w:keepNext/>
+      </w:pPr>
+      <w:r>
+        <w:t xml:space="preserve">Betriebsart des Stromspeicherlaufs des laufenden Stands, wie die Kachel des Reiters „Stromspeicher“. · </w:t>
+      </w:r>
+      <w:r>
+        <w:rPr>
+          <w:noProof/>
+          <w:color w:val="7F7F7F"/>
+        </w:rPr>
+        <w:t xml:space="preserve">stand.speicher.betriebsart</w:t>
+      </w:r>
+    </w:p>
+    <w:p>
+      <w:pPr>
+        <w:pStyle w:val="Normal"/>
+      </w:pPr>
+      <w:r>
+        <w:rPr>
+          <w:noProof/>
+        </w:rPr>
+        <w:t xml:space="preserve">{{stand.speicher.betriebsart}}</w:t>
+      </w:r>
+    </w:p>
+    <w:p>
+      <w:pPr>
+        <w:pStyle w:val="Hinweis"/>
+        <w:keepNext/>
+      </w:pPr>
+      <w:r>
+        <w:t xml:space="preserve">Berechnungsart des Stromspeicherlaufs des laufenden Stands, wie die Kachel des Reiters „Stromspeicher“. · </w:t>
+      </w:r>
+      <w:r>
+        <w:rPr>
+          <w:noProof/>
+          <w:color w:val="7F7F7F"/>
+        </w:rPr>
+        <w:t xml:space="preserve">stand.speicher.berechnungsart</w:t>
+      </w:r>
+    </w:p>
+    <w:p>
+      <w:pPr>
+        <w:pStyle w:val="Normal"/>
+      </w:pPr>
+      <w:r>
+        <w:rPr>
+          <w:noProof/>
+        </w:rPr>
+        <w:t xml:space="preserve">{{stand.speicher.berechnungsart}}</w:t>
+      </w:r>
+    </w:p>
+    <w:p>
+      <w:pPr>
         <w:pStyle w:val="Heading3"/>
       </w:pPr>
       <w:r>
@@ -38066,6 +38880,195 @@
           <w:noProof/>
         </w:rPr>
         <w:t xml:space="preserve">{{stand.wirtschaft.nettobarwert.unguenstig}}</w:t>
+      </w:r>
+    </w:p>
+    <w:p>
+      <w:pPr>
+        <w:pStyle w:val="Hinweis"/>
+        <w:keepNext/>
+      </w:pPr>
+      <w:r>
+        <w:t xml:space="preserve">Ertrag des Stromspeichers (degradationsäquivalent) in €/a aus dem Speicherlauf des laufenden Stands. · </w:t>
+      </w:r>
+      <w:r>
+        <w:rPr>
+          <w:noProof/>
+          <w:color w:val="7F7F7F"/>
+        </w:rPr>
+        <w:t xml:space="preserve">stand.speicher.ertrag</w:t>
+      </w:r>
+    </w:p>
+    <w:p>
+      <w:pPr>
+        <w:pStyle w:val="Normal"/>
+      </w:pPr>
+      <w:r>
+        <w:rPr>
+          <w:noProof/>
+        </w:rPr>
+        <w:t xml:space="preserve">{{stand.speicher.ertrag}}</w:t>
+      </w:r>
+    </w:p>
+    <w:p>
+      <w:pPr>
+        <w:pStyle w:val="Hinweis"/>
+        <w:keepNext/>
+      </w:pPr>
+      <w:r>
+        <w:t xml:space="preserve">Jahresüberschuss des Stromspeichers in €/a aus dem Speicherlauf des laufenden Stands. · </w:t>
+      </w:r>
+      <w:r>
+        <w:rPr>
+          <w:noProof/>
+          <w:color w:val="7F7F7F"/>
+        </w:rPr>
+        <w:t xml:space="preserve">stand.speicher.ueberschuss</w:t>
+      </w:r>
+    </w:p>
+    <w:p>
+      <w:pPr>
+        <w:pStyle w:val="Normal"/>
+      </w:pPr>
+      <w:r>
+        <w:rPr>
+          <w:noProof/>
+        </w:rPr>
+        <w:t xml:space="preserve">{{stand.speicher.ueberschuss}}</w:t>
+      </w:r>
+    </w:p>
+    <w:p>
+      <w:pPr>
+        <w:pStyle w:val="Hinweis"/>
+        <w:keepNext/>
+      </w:pPr>
+      <w:r>
+        <w:t xml:space="preserve">Statische Amortisation des Stromspeichers in Jahren; leer ohne Investition. · </w:t>
+      </w:r>
+      <w:r>
+        <w:rPr>
+          <w:noProof/>
+          <w:color w:val="7F7F7F"/>
+        </w:rPr>
+        <w:t xml:space="preserve">stand.speicher.amortisation</w:t>
+      </w:r>
+    </w:p>
+    <w:p>
+      <w:pPr>
+        <w:pStyle w:val="Normal"/>
+      </w:pPr>
+      <w:r>
+        <w:rPr>
+          <w:noProof/>
+        </w:rPr>
+        <w:t xml:space="preserve">{{stand.speicher.amortisation}}</w:t>
+      </w:r>
+    </w:p>
+    <w:p>
+      <w:pPr>
+        <w:pStyle w:val="Hinweis"/>
+        <w:keepNext/>
+      </w:pPr>
+      <w:r>
+        <w:t xml:space="preserve">Äquivalente Vollzyklen des Stromspeichers je Jahr aus dem Speicherlauf des laufenden Stands. · </w:t>
+      </w:r>
+      <w:r>
+        <w:rPr>
+          <w:noProof/>
+          <w:color w:val="7F7F7F"/>
+        </w:rPr>
+        <w:t xml:space="preserve">stand.speicher.vollzyklen</w:t>
+      </w:r>
+    </w:p>
+    <w:p>
+      <w:pPr>
+        <w:pStyle w:val="Normal"/>
+      </w:pPr>
+      <w:r>
+        <w:rPr>
+          <w:noProof/>
+        </w:rPr>
+        <w:t xml:space="preserve">{{stand.speicher.vollzyklen}}</w:t>
+      </w:r>
+    </w:p>
+    <w:p>
+      <w:pPr>
+        <w:pStyle w:val="Hinweis"/>
+        <w:keepNext/>
+      </w:pPr>
+      <w:r>
+        <w:t xml:space="preserve">Eigenverbrauchsquote mit Stromspeicher in % aus dem Speicherlauf des laufenden Stands. · </w:t>
+      </w:r>
+      <w:r>
+        <w:rPr>
+          <w:noProof/>
+          <w:color w:val="7F7F7F"/>
+        </w:rPr>
+        <w:t xml:space="preserve">stand.speicher.eigenverbrauch</w:t>
+      </w:r>
+    </w:p>
+    <w:p>
+      <w:pPr>
+        <w:pStyle w:val="Normal"/>
+      </w:pPr>
+      <w:r>
+        <w:rPr>
+          <w:noProof/>
+        </w:rPr>
+        <w:t xml:space="preserve">{{stand.speicher.eigenverbrauch}}</w:t>
+      </w:r>
+    </w:p>
+    <w:p>
+      <w:pPr>
+        <w:pStyle w:val="Hinweis"/>
+        <w:keepNext/>
+      </w:pPr>
+      <w:r>
+        <w:t xml:space="preserve">Autarkiegrad mit Stromspeicher in % aus dem Speicherlauf des laufenden Stands. · </w:t>
+      </w:r>
+      <w:r>
+        <w:rPr>
+          <w:noProof/>
+          <w:color w:val="7F7F7F"/>
+        </w:rPr>
+        <w:t xml:space="preserve">stand.speicher.autarkie</w:t>
+      </w:r>
+    </w:p>
+    <w:p>
+      <w:pPr>
+        <w:pStyle w:val="Normal"/>
+      </w:pPr>
+      <w:r>
+        <w:rPr>
+          <w:noProof/>
+        </w:rPr>
+        <w:t xml:space="preserve">{{stand.speicher.autarkie}}</w:t>
+      </w:r>
+    </w:p>
+    <w:p>
+      <w:pPr>
+        <w:pStyle w:val="Hinweis"/>
+        <w:keepNext/>
+      </w:pPr>
+      <w:r>
+        <w:t xml:space="preserve">Deckung des Wärmebedarfs durch die Solarthermie in % aus dem gespeicherten Ergebnis des laufenden Stands. · </w:t>
+      </w:r>
+      <w:r>
+        <w:rPr>
+          <w:noProof/>
+          <w:color w:val="7F7F7F"/>
+        </w:rPr>
+        <w:t xml:space="preserve">stand.solarthermie.deckung</w:t>
+      </w:r>
+    </w:p>
+    <w:p>
+      <w:pPr>
+        <w:pStyle w:val="Normal"/>
+      </w:pPr>
+      <w:r>
+        <w:rPr>
+          <w:noProof/>
+        </w:rPr>
+        <w:t xml:space="preserve">{{stand.solarthermie.deckung}}</w:t>
       </w:r>
     </w:p>
     <w:p>
@@ -38838,6 +39841,556 @@
     </w:p>
     <w:p>
       <w:pPr>
+        <w:pStyle w:val="Hinweis"/>
+        <w:keepNext/>
+      </w:pPr>
+      <w:r>
+        <w:t xml:space="preserve">Bild je Stand: Wärmelast im Jahresverlauf, normiert auf den Jahreshöchstwert (Summe und Wärmekanäle) — wie der Reiter „Bedarf“ des Simulationsergebnisses; braucht die Stundenreihen des Laufs. · </w:t>
+      </w:r>
+      <w:r>
+        <w:rPr>
+          <w:noProof/>
+          <w:color w:val="7F7F7F"/>
+        </w:rPr>
+        <w:t xml:space="preserve">stand.bild.bedarf_waerme</w:t>
+      </w:r>
+    </w:p>
+    <w:p>
+      <w:r>
+        <w:drawing>
+          <wp:inline xmlns:wp="http://schemas.openxmlformats.org/drawingml/2006/wordprocessingDrawing" distT="0" distB="0" distL="0" distR="0">
+            <wp:extent cx="2970212" cy="1910104"/>
+            <wp:effectExtent l="0" t="0" r="0" b="0"/>
+            <wp:docPr id="18" name="Baukasten stand.bild.bedarf_waerme" descr="{{stand.bild.bedarf_waerme}}"/>
+            <wp:cNvGraphicFramePr>
+              <a:graphicFrameLocks xmlns:a="http://schemas.openxmlformats.org/drawingml/2006/main" noChangeAspect="1"/>
+            </wp:cNvGraphicFramePr>
+            <a:graphic xmlns:a="http://schemas.openxmlformats.org/drawingml/2006/main">
+              <a:graphicData uri="http://schemas.openxmlformats.org/drawingml/2006/picture">
+                <pic:pic xmlns:pic="http://schemas.openxmlformats.org/drawingml/2006/picture">
+                  <pic:nvPicPr>
+                    <pic:cNvPr id="0" name="Diagramm18.png" descr="{{stand.bild.bedarf_waerme}}"/>
+                    <pic:cNvPicPr/>
+                  </pic:nvPicPr>
+                  <pic:blipFill>
+                    <a:blip xmlns:r="http://schemas.openxmlformats.org/officeDocument/2006/relationships" r:embed="rIdMusterbild3"/>
+                    <a:stretch>
+                      <a:fillRect/>
+                    </a:stretch>
+                  </pic:blipFill>
+                  <pic:spPr>
+                    <a:xfrm>
+                      <a:off x="0" y="0"/>
+                      <a:ext cx="2970212" cy="1910104"/>
+                    </a:xfrm>
+                    <a:prstGeom prst="rect">
+                      <a:avLst/>
+                    </a:prstGeom>
+                  </pic:spPr>
+                </pic:pic>
+              </a:graphicData>
+            </a:graphic>
+          </wp:inline>
+        </w:drawing>
+      </w:r>
+    </w:p>
+    <w:p>
+      <w:pPr>
+        <w:pStyle w:val="Hinweis"/>
+        <w:keepNext/>
+      </w:pPr>
+      <w:r>
+        <w:t xml:space="preserve">Bild je Stand: Strombedarf im Jahresverlauf, normiert auf den Jahreshöchstwert — wie der Reiter „Bedarf“ des Simulationsergebnisses; braucht die Stundenreihen des Laufs. · </w:t>
+      </w:r>
+      <w:r>
+        <w:rPr>
+          <w:noProof/>
+          <w:color w:val="7F7F7F"/>
+        </w:rPr>
+        <w:t xml:space="preserve">stand.bild.bedarf_strom</w:t>
+      </w:r>
+    </w:p>
+    <w:p>
+      <w:r>
+        <w:drawing>
+          <wp:inline xmlns:wp="http://schemas.openxmlformats.org/drawingml/2006/wordprocessingDrawing" distT="0" distB="0" distL="0" distR="0">
+            <wp:extent cx="2970212" cy="1910104"/>
+            <wp:effectExtent l="0" t="0" r="0" b="0"/>
+            <wp:docPr id="19" name="Baukasten stand.bild.bedarf_strom" descr="{{stand.bild.bedarf_strom}}"/>
+            <wp:cNvGraphicFramePr>
+              <a:graphicFrameLocks xmlns:a="http://schemas.openxmlformats.org/drawingml/2006/main" noChangeAspect="1"/>
+            </wp:cNvGraphicFramePr>
+            <a:graphic xmlns:a="http://schemas.openxmlformats.org/drawingml/2006/main">
+              <a:graphicData uri="http://schemas.openxmlformats.org/drawingml/2006/picture">
+                <pic:pic xmlns:pic="http://schemas.openxmlformats.org/drawingml/2006/picture">
+                  <pic:nvPicPr>
+                    <pic:cNvPr id="0" name="Diagramm19.png" descr="{{stand.bild.bedarf_strom}}"/>
+                    <pic:cNvPicPr/>
+                  </pic:nvPicPr>
+                  <pic:blipFill>
+                    <a:blip xmlns:r="http://schemas.openxmlformats.org/officeDocument/2006/relationships" r:embed="rIdMusterbild3"/>
+                    <a:stretch>
+                      <a:fillRect/>
+                    </a:stretch>
+                  </pic:blipFill>
+                  <pic:spPr>
+                    <a:xfrm>
+                      <a:off x="0" y="0"/>
+                      <a:ext cx="2970212" cy="1910104"/>
+                    </a:xfrm>
+                    <a:prstGeom prst="rect">
+                      <a:avLst/>
+                    </a:prstGeom>
+                  </pic:spPr>
+                </pic:pic>
+              </a:graphicData>
+            </a:graphic>
+          </wp:inline>
+        </w:drawing>
+      </w:r>
+    </w:p>
+    <w:p>
+      <w:pPr>
+        <w:pStyle w:val="Hinweis"/>
+        <w:keepNext/>
+      </w:pPr>
+      <w:r>
+        <w:t xml:space="preserve">Bild je Stand: Kältelast im Jahresverlauf, normiert auf den Jahreshöchstwert — wie der Reiter „Bedarf“ des Simulationsergebnisses; leer ohne Kältebedarf. · </w:t>
+      </w:r>
+      <w:r>
+        <w:rPr>
+          <w:noProof/>
+          <w:color w:val="7F7F7F"/>
+        </w:rPr>
+        <w:t xml:space="preserve">stand.bild.bedarf_kaelte</w:t>
+      </w:r>
+    </w:p>
+    <w:p>
+      <w:r>
+        <w:drawing>
+          <wp:inline xmlns:wp="http://schemas.openxmlformats.org/drawingml/2006/wordprocessingDrawing" distT="0" distB="0" distL="0" distR="0">
+            <wp:extent cx="2970212" cy="1910104"/>
+            <wp:effectExtent l="0" t="0" r="0" b="0"/>
+            <wp:docPr id="20" name="Baukasten stand.bild.bedarf_kaelte" descr="{{stand.bild.bedarf_kaelte}}"/>
+            <wp:cNvGraphicFramePr>
+              <a:graphicFrameLocks xmlns:a="http://schemas.openxmlformats.org/drawingml/2006/main" noChangeAspect="1"/>
+            </wp:cNvGraphicFramePr>
+            <a:graphic xmlns:a="http://schemas.openxmlformats.org/drawingml/2006/main">
+              <a:graphicData uri="http://schemas.openxmlformats.org/drawingml/2006/picture">
+                <pic:pic xmlns:pic="http://schemas.openxmlformats.org/drawingml/2006/picture">
+                  <pic:nvPicPr>
+                    <pic:cNvPr id="0" name="Diagramm20.png" descr="{{stand.bild.bedarf_kaelte}}"/>
+                    <pic:cNvPicPr/>
+                  </pic:nvPicPr>
+                  <pic:blipFill>
+                    <a:blip xmlns:r="http://schemas.openxmlformats.org/officeDocument/2006/relationships" r:embed="rIdMusterbild3"/>
+                    <a:stretch>
+                      <a:fillRect/>
+                    </a:stretch>
+                  </pic:blipFill>
+                  <pic:spPr>
+                    <a:xfrm>
+                      <a:off x="0" y="0"/>
+                      <a:ext cx="2970212" cy="1910104"/>
+                    </a:xfrm>
+                    <a:prstGeom prst="rect">
+                      <a:avLst/>
+                    </a:prstGeom>
+                  </pic:spPr>
+                </pic:pic>
+              </a:graphicData>
+            </a:graphic>
+          </wp:inline>
+        </w:drawing>
+      </w:r>
+    </w:p>
+    <w:p>
+      <w:pPr>
+        <w:pStyle w:val="Hinweis"/>
+        <w:keepNext/>
+      </w:pPr>
+      <w:r>
+        <w:t xml:space="preserve">Bild je Stand: Wärmeproduktion der Wärmepumpe und des Heizstabs mit dem Wärmebedarf als Linie über die Jahresstunden — wie der Reiter „Wärmepumpe“; leer ohne Wärmepumpe. · </w:t>
+      </w:r>
+      <w:r>
+        <w:rPr>
+          <w:noProof/>
+          <w:color w:val="7F7F7F"/>
+        </w:rPr>
+        <w:t xml:space="preserve">stand.bild.waermepumpe</w:t>
+      </w:r>
+    </w:p>
+    <w:p>
+      <w:r>
+        <w:drawing>
+          <wp:inline xmlns:wp="http://schemas.openxmlformats.org/drawingml/2006/wordprocessingDrawing" distT="0" distB="0" distL="0" distR="0">
+            <wp:extent cx="2970212" cy="1910104"/>
+            <wp:effectExtent l="0" t="0" r="0" b="0"/>
+            <wp:docPr id="21" name="Baukasten stand.bild.waermepumpe" descr="{{stand.bild.waermepumpe}}"/>
+            <wp:cNvGraphicFramePr>
+              <a:graphicFrameLocks xmlns:a="http://schemas.openxmlformats.org/drawingml/2006/main" noChangeAspect="1"/>
+            </wp:cNvGraphicFramePr>
+            <a:graphic xmlns:a="http://schemas.openxmlformats.org/drawingml/2006/main">
+              <a:graphicData uri="http://schemas.openxmlformats.org/drawingml/2006/picture">
+                <pic:pic xmlns:pic="http://schemas.openxmlformats.org/drawingml/2006/picture">
+                  <pic:nvPicPr>
+                    <pic:cNvPr id="0" name="Diagramm21.png" descr="{{stand.bild.waermepumpe}}"/>
+                    <pic:cNvPicPr/>
+                  </pic:nvPicPr>
+                  <pic:blipFill>
+                    <a:blip xmlns:r="http://schemas.openxmlformats.org/officeDocument/2006/relationships" r:embed="rIdMusterbild3"/>
+                    <a:stretch>
+                      <a:fillRect/>
+                    </a:stretch>
+                  </pic:blipFill>
+                  <pic:spPr>
+                    <a:xfrm>
+                      <a:off x="0" y="0"/>
+                      <a:ext cx="2970212" cy="1910104"/>
+                    </a:xfrm>
+                    <a:prstGeom prst="rect">
+                      <a:avLst/>
+                    </a:prstGeom>
+                  </pic:spPr>
+                </pic:pic>
+              </a:graphicData>
+            </a:graphic>
+          </wp:inline>
+        </w:drawing>
+      </w:r>
+    </w:p>
+    <w:p>
+      <w:pPr>
+        <w:pStyle w:val="Hinweis"/>
+        <w:keepNext/>
+      </w:pPr>
+      <w:r>
+        <w:t xml:space="preserve">Bild je Stand: Stromverbrauch der Wärmepumpe samt Heizstab im Jahresverlauf — wie der Reiter „Wärmepumpe“; leer ohne Wärmepumpe. · </w:t>
+      </w:r>
+      <w:r>
+        <w:rPr>
+          <w:noProof/>
+          <w:color w:val="7F7F7F"/>
+        </w:rPr>
+        <w:t xml:space="preserve">stand.bild.waermepumpe_strom</w:t>
+      </w:r>
+    </w:p>
+    <w:p>
+      <w:r>
+        <w:drawing>
+          <wp:inline xmlns:wp="http://schemas.openxmlformats.org/drawingml/2006/wordprocessingDrawing" distT="0" distB="0" distL="0" distR="0">
+            <wp:extent cx="2970212" cy="1910104"/>
+            <wp:effectExtent l="0" t="0" r="0" b="0"/>
+            <wp:docPr id="22" name="Baukasten stand.bild.waermepumpe_strom" descr="{{stand.bild.waermepumpe_strom}}"/>
+            <wp:cNvGraphicFramePr>
+              <a:graphicFrameLocks xmlns:a="http://schemas.openxmlformats.org/drawingml/2006/main" noChangeAspect="1"/>
+            </wp:cNvGraphicFramePr>
+            <a:graphic xmlns:a="http://schemas.openxmlformats.org/drawingml/2006/main">
+              <a:graphicData uri="http://schemas.openxmlformats.org/drawingml/2006/picture">
+                <pic:pic xmlns:pic="http://schemas.openxmlformats.org/drawingml/2006/picture">
+                  <pic:nvPicPr>
+                    <pic:cNvPr id="0" name="Diagramm22.png" descr="{{stand.bild.waermepumpe_strom}}"/>
+                    <pic:cNvPicPr/>
+                  </pic:nvPicPr>
+                  <pic:blipFill>
+                    <a:blip xmlns:r="http://schemas.openxmlformats.org/officeDocument/2006/relationships" r:embed="rIdMusterbild3"/>
+                    <a:stretch>
+                      <a:fillRect/>
+                    </a:stretch>
+                  </pic:blipFill>
+                  <pic:spPr>
+                    <a:xfrm>
+                      <a:off x="0" y="0"/>
+                      <a:ext cx="2970212" cy="1910104"/>
+                    </a:xfrm>
+                    <a:prstGeom prst="rect">
+                      <a:avLst/>
+                    </a:prstGeom>
+                  </pic:spPr>
+                </pic:pic>
+              </a:graphicData>
+            </a:graphic>
+          </wp:inline>
+        </w:drawing>
+      </w:r>
+    </w:p>
+    <w:p>
+      <w:pPr>
+        <w:pStyle w:val="Hinweis"/>
+        <w:keepNext/>
+      </w:pPr>
+      <w:r>
+        <w:t xml:space="preserve">Bild je Stand: Leistung über der Außentemperatur (Wärmebedarf, Heizstab, Wärmeproduktion der Wärmepumpe) — wie der Reiter „Wärmepumpe“; nur im Word-Bericht. · </w:t>
+      </w:r>
+      <w:r>
+        <w:rPr>
+          <w:noProof/>
+          <w:color w:val="7F7F7F"/>
+        </w:rPr>
+        <w:t xml:space="preserve">stand.bild.waermepumpe_streuwolke</w:t>
+      </w:r>
+    </w:p>
+    <w:p>
+      <w:r>
+        <w:drawing>
+          <wp:inline xmlns:wp="http://schemas.openxmlformats.org/drawingml/2006/wordprocessingDrawing" distT="0" distB="0" distL="0" distR="0">
+            <wp:extent cx="2970212" cy="1910104"/>
+            <wp:effectExtent l="0" t="0" r="0" b="0"/>
+            <wp:docPr id="23" name="Baukasten stand.bild.waermepumpe_streuwolke" descr="{{stand.bild.waermepumpe_streuwolke}}"/>
+            <wp:cNvGraphicFramePr>
+              <a:graphicFrameLocks xmlns:a="http://schemas.openxmlformats.org/drawingml/2006/main" noChangeAspect="1"/>
+            </wp:cNvGraphicFramePr>
+            <a:graphic xmlns:a="http://schemas.openxmlformats.org/drawingml/2006/main">
+              <a:graphicData uri="http://schemas.openxmlformats.org/drawingml/2006/picture">
+                <pic:pic xmlns:pic="http://schemas.openxmlformats.org/drawingml/2006/picture">
+                  <pic:nvPicPr>
+                    <pic:cNvPr id="0" name="Diagramm23.png" descr="{{stand.bild.waermepumpe_streuwolke}}"/>
+                    <pic:cNvPicPr/>
+                  </pic:nvPicPr>
+                  <pic:blipFill>
+                    <a:blip xmlns:r="http://schemas.openxmlformats.org/officeDocument/2006/relationships" r:embed="rIdMusterbild3"/>
+                    <a:stretch>
+                      <a:fillRect/>
+                    </a:stretch>
+                  </pic:blipFill>
+                  <pic:spPr>
+                    <a:xfrm>
+                      <a:off x="0" y="0"/>
+                      <a:ext cx="2970212" cy="1910104"/>
+                    </a:xfrm>
+                    <a:prstGeom prst="rect">
+                      <a:avLst/>
+                    </a:prstGeom>
+                  </pic:spPr>
+                </pic:pic>
+              </a:graphicData>
+            </a:graphic>
+          </wp:inline>
+        </w:drawing>
+      </w:r>
+    </w:p>
+    <w:p>
+      <w:pPr>
+        <w:pStyle w:val="Hinweis"/>
+        <w:keepNext/>
+      </w:pPr>
+      <w:r>
+        <w:t xml:space="preserve">Bild je Stand: Wärmeproduktion der Heizkessel mit Restwärme und Wärmebedarf als Linien im Jahresverlauf — wie der Reiter „Heizkessel“; leer ohne Kessel. · </w:t>
+      </w:r>
+      <w:r>
+        <w:rPr>
+          <w:noProof/>
+          <w:color w:val="7F7F7F"/>
+        </w:rPr>
+        <w:t xml:space="preserve">stand.bild.heizkessel</w:t>
+      </w:r>
+    </w:p>
+    <w:p>
+      <w:r>
+        <w:drawing>
+          <wp:inline xmlns:wp="http://schemas.openxmlformats.org/drawingml/2006/wordprocessingDrawing" distT="0" distB="0" distL="0" distR="0">
+            <wp:extent cx="2970212" cy="1910104"/>
+            <wp:effectExtent l="0" t="0" r="0" b="0"/>
+            <wp:docPr id="24" name="Baukasten stand.bild.heizkessel" descr="{{stand.bild.heizkessel}}"/>
+            <wp:cNvGraphicFramePr>
+              <a:graphicFrameLocks xmlns:a="http://schemas.openxmlformats.org/drawingml/2006/main" noChangeAspect="1"/>
+            </wp:cNvGraphicFramePr>
+            <a:graphic xmlns:a="http://schemas.openxmlformats.org/drawingml/2006/main">
+              <a:graphicData uri="http://schemas.openxmlformats.org/drawingml/2006/picture">
+                <pic:pic xmlns:pic="http://schemas.openxmlformats.org/drawingml/2006/picture">
+                  <pic:nvPicPr>
+                    <pic:cNvPr id="0" name="Diagramm24.png" descr="{{stand.bild.heizkessel}}"/>
+                    <pic:cNvPicPr/>
+                  </pic:nvPicPr>
+                  <pic:blipFill>
+                    <a:blip xmlns:r="http://schemas.openxmlformats.org/officeDocument/2006/relationships" r:embed="rIdMusterbild3"/>
+                    <a:stretch>
+                      <a:fillRect/>
+                    </a:stretch>
+                  </pic:blipFill>
+                  <pic:spPr>
+                    <a:xfrm>
+                      <a:off x="0" y="0"/>
+                      <a:ext cx="2970212" cy="1910104"/>
+                    </a:xfrm>
+                    <a:prstGeom prst="rect">
+                      <a:avLst/>
+                    </a:prstGeom>
+                  </pic:spPr>
+                </pic:pic>
+              </a:graphicData>
+            </a:graphic>
+          </wp:inline>
+        </w:drawing>
+      </w:r>
+    </w:p>
+    <w:p>
+      <w:pPr>
+        <w:pStyle w:val="Hinweis"/>
+        <w:keepNext/>
+      </w:pPr>
+      <w:r>
+        <w:t xml:space="preserve">Bild je Stand: Wärmebedarf und Wärmeproduktion der Solarthermie über die Jahresstunden — wie der Reiter „Solarthermie“; leer ohne Solarthermie. · </w:t>
+      </w:r>
+      <w:r>
+        <w:rPr>
+          <w:noProof/>
+          <w:color w:val="7F7F7F"/>
+        </w:rPr>
+        <w:t xml:space="preserve">stand.bild.solarthermie</w:t>
+      </w:r>
+    </w:p>
+    <w:p>
+      <w:r>
+        <w:drawing>
+          <wp:inline xmlns:wp="http://schemas.openxmlformats.org/drawingml/2006/wordprocessingDrawing" distT="0" distB="0" distL="0" distR="0">
+            <wp:extent cx="2970212" cy="1910104"/>
+            <wp:effectExtent l="0" t="0" r="0" b="0"/>
+            <wp:docPr id="25" name="Baukasten stand.bild.solarthermie" descr="{{stand.bild.solarthermie}}"/>
+            <wp:cNvGraphicFramePr>
+              <a:graphicFrameLocks xmlns:a="http://schemas.openxmlformats.org/drawingml/2006/main" noChangeAspect="1"/>
+            </wp:cNvGraphicFramePr>
+            <a:graphic xmlns:a="http://schemas.openxmlformats.org/drawingml/2006/main">
+              <a:graphicData uri="http://schemas.openxmlformats.org/drawingml/2006/picture">
+                <pic:pic xmlns:pic="http://schemas.openxmlformats.org/drawingml/2006/picture">
+                  <pic:nvPicPr>
+                    <pic:cNvPr id="0" name="Diagramm25.png" descr="{{stand.bild.solarthermie}}"/>
+                    <pic:cNvPicPr/>
+                  </pic:nvPicPr>
+                  <pic:blipFill>
+                    <a:blip xmlns:r="http://schemas.openxmlformats.org/officeDocument/2006/relationships" r:embed="rIdMusterbild3"/>
+                    <a:stretch>
+                      <a:fillRect/>
+                    </a:stretch>
+                  </pic:blipFill>
+                  <pic:spPr>
+                    <a:xfrm>
+                      <a:off x="0" y="0"/>
+                      <a:ext cx="2970212" cy="1910104"/>
+                    </a:xfrm>
+                    <a:prstGeom prst="rect">
+                      <a:avLst/>
+                    </a:prstGeom>
+                  </pic:spPr>
+                </pic:pic>
+              </a:graphicData>
+            </a:graphic>
+          </wp:inline>
+        </w:drawing>
+      </w:r>
+    </w:p>
+    <w:p>
+      <w:pPr>
+        <w:pStyle w:val="Hinweis"/>
+        <w:keepNext/>
+      </w:pPr>
+      <w:r>
+        <w:t xml:space="preserve">Bild je Stand: Wärmeproduktion des BHKW mit Restwärme und Wärmebedarf als Linien im Jahresverlauf — wie der Reiter „BHKW“; leer ohne BHKW. · </w:t>
+      </w:r>
+      <w:r>
+        <w:rPr>
+          <w:noProof/>
+          <w:color w:val="7F7F7F"/>
+        </w:rPr>
+        <w:t xml:space="preserve">stand.bild.bhkw</w:t>
+      </w:r>
+    </w:p>
+    <w:p>
+      <w:r>
+        <w:drawing>
+          <wp:inline xmlns:wp="http://schemas.openxmlformats.org/drawingml/2006/wordprocessingDrawing" distT="0" distB="0" distL="0" distR="0">
+            <wp:extent cx="2970212" cy="1910104"/>
+            <wp:effectExtent l="0" t="0" r="0" b="0"/>
+            <wp:docPr id="26" name="Baukasten stand.bild.bhkw" descr="{{stand.bild.bhkw}}"/>
+            <wp:cNvGraphicFramePr>
+              <a:graphicFrameLocks xmlns:a="http://schemas.openxmlformats.org/drawingml/2006/main" noChangeAspect="1"/>
+            </wp:cNvGraphicFramePr>
+            <a:graphic xmlns:a="http://schemas.openxmlformats.org/drawingml/2006/main">
+              <a:graphicData uri="http://schemas.openxmlformats.org/drawingml/2006/picture">
+                <pic:pic xmlns:pic="http://schemas.openxmlformats.org/drawingml/2006/picture">
+                  <pic:nvPicPr>
+                    <pic:cNvPr id="0" name="Diagramm26.png" descr="{{stand.bild.bhkw}}"/>
+                    <pic:cNvPicPr/>
+                  </pic:nvPicPr>
+                  <pic:blipFill>
+                    <a:blip xmlns:r="http://schemas.openxmlformats.org/officeDocument/2006/relationships" r:embed="rIdMusterbild3"/>
+                    <a:stretch>
+                      <a:fillRect/>
+                    </a:stretch>
+                  </pic:blipFill>
+                  <pic:spPr>
+                    <a:xfrm>
+                      <a:off x="0" y="0"/>
+                      <a:ext cx="2970212" cy="1910104"/>
+                    </a:xfrm>
+                    <a:prstGeom prst="rect">
+                      <a:avLst/>
+                    </a:prstGeom>
+                  </pic:spPr>
+                </pic:pic>
+              </a:graphicData>
+            </a:graphic>
+          </wp:inline>
+        </w:drawing>
+      </w:r>
+    </w:p>
+    <w:p>
+      <w:pPr>
+        <w:pStyle w:val="Hinweis"/>
+        <w:keepNext/>
+      </w:pPr>
+      <w:r>
+        <w:t xml:space="preserve">Bild je Stand: Erzeugung der Photovoltaik, Überschuss und Strombedarf im Jahresverlauf (Stundenwerte) — wie der Reiter „Photovoltaik“; leer ohne Photovoltaik. · </w:t>
+      </w:r>
+      <w:r>
+        <w:rPr>
+          <w:noProof/>
+          <w:color w:val="7F7F7F"/>
+        </w:rPr>
+        <w:t xml:space="preserve">stand.bild.photovoltaik</w:t>
+      </w:r>
+    </w:p>
+    <w:p>
+      <w:r>
+        <w:drawing>
+          <wp:inline xmlns:wp="http://schemas.openxmlformats.org/drawingml/2006/wordprocessingDrawing" distT="0" distB="0" distL="0" distR="0">
+            <wp:extent cx="2970212" cy="1910104"/>
+            <wp:effectExtent l="0" t="0" r="0" b="0"/>
+            <wp:docPr id="27" name="Baukasten stand.bild.photovoltaik" descr="{{stand.bild.photovoltaik}}"/>
+            <wp:cNvGraphicFramePr>
+              <a:graphicFrameLocks xmlns:a="http://schemas.openxmlformats.org/drawingml/2006/main" noChangeAspect="1"/>
+            </wp:cNvGraphicFramePr>
+            <a:graphic xmlns:a="http://schemas.openxmlformats.org/drawingml/2006/main">
+              <a:graphicData uri="http://schemas.openxmlformats.org/drawingml/2006/picture">
+                <pic:pic xmlns:pic="http://schemas.openxmlformats.org/drawingml/2006/picture">
+                  <pic:nvPicPr>
+                    <pic:cNvPr id="0" name="Diagramm27.png" descr="{{stand.bild.photovoltaik}}"/>
+                    <pic:cNvPicPr/>
+                  </pic:nvPicPr>
+                  <pic:blipFill>
+                    <a:blip xmlns:r="http://schemas.openxmlformats.org/officeDocument/2006/relationships" r:embed="rIdMusterbild3"/>
+                    <a:stretch>
+                      <a:fillRect/>
+                    </a:stretch>
+                  </pic:blipFill>
+                  <pic:spPr>
+                    <a:xfrm>
+                      <a:off x="0" y="0"/>
+                      <a:ext cx="2970212" cy="1910104"/>
+                    </a:xfrm>
+                    <a:prstGeom prst="rect">
+                      <a:avLst/>
+                    </a:prstGeom>
+                  </pic:spPr>
+                </pic:pic>
+              </a:graphicData>
+            </a:graphic>
+          </wp:inline>
+        </w:drawing>
+      </w:r>
+    </w:p>
+    <w:p>
+      <w:pPr>
         <w:pStyle w:val="Heading3"/>
       </w:pPr>
       <w:r>
@@ -39226,6 +40779,82 @@
     </w:p>
     <w:p>
       <w:pPr>
+        <w:pStyle w:val="Hinweis"/>
+        <w:keepNext/>
+      </w:pPr>
+      <w:r>
+        <w:t xml:space="preserve">Schalter: Trägt das Ergebnis des laufenden Stands einen Lauf des Stromspeichers (Einzelanlage)? · </w:t>
+      </w:r>
+      <w:r>
+        <w:rPr>
+          <w:noProof/>
+          <w:color w:val="7F7F7F"/>
+        </w:rPr>
+        <w:t xml:space="preserve">stand.hat_speicherlauf</w:t>
+      </w:r>
+    </w:p>
+    <w:p>
+      <w:pPr>
+        <w:pStyle w:val="Normal"/>
+      </w:pPr>
+      <w:r>
+        <w:rPr>
+          <w:noProof/>
+        </w:rPr>
+        <w:t xml:space="preserve">{{#wenn stand.hat_speicherlauf}}</w:t>
+      </w:r>
+    </w:p>
+    <w:p>
+      <w:pPr>
+        <w:pStyle w:val="Normal"/>
+      </w:pPr>
+      <w:r>
+        <w:t xml:space="preserve">Schalter: Trägt das Ergebnis des laufenden Stands einen Lauf des Stromspeichers (Einzelanlage)?: trifft zu</w:t>
+      </w:r>
+    </w:p>
+    <w:p>
+      <w:pPr>
+        <w:pStyle w:val="Normal"/>
+      </w:pPr>
+      <w:r>
+        <w:rPr>
+          <w:noProof/>
+        </w:rPr>
+        <w:t xml:space="preserve">{{/wenn}}</w:t>
+      </w:r>
+    </w:p>
+    <w:p>
+      <w:pPr>
+        <w:pStyle w:val="Normal"/>
+      </w:pPr>
+      <w:r>
+        <w:rPr>
+          <w:noProof/>
+        </w:rPr>
+        <w:t xml:space="preserve">{{#wenn nicht stand.hat_speicherlauf}}</w:t>
+      </w:r>
+    </w:p>
+    <w:p>
+      <w:pPr>
+        <w:pStyle w:val="Normal"/>
+      </w:pPr>
+      <w:r>
+        <w:t xml:space="preserve">Schalter: Trägt das Ergebnis des laufenden Stands einen Lauf des Stromspeichers (Einzelanlage)?: trifft nicht zu</w:t>
+      </w:r>
+    </w:p>
+    <w:p>
+      <w:pPr>
+        <w:pStyle w:val="Normal"/>
+      </w:pPr>
+      <w:r>
+        <w:rPr>
+          <w:noProof/>
+        </w:rPr>
+        <w:t xml:space="preserve">{{/wenn}}</w:t>
+      </w:r>
+    </w:p>
+    <w:p>
+      <w:pPr>
         <w:pStyle w:val="Normal"/>
       </w:pPr>
       <w:r>
@@ -39848,6 +41477,86 @@
           <w:color w:val="7F7F7F"/>
         </w:rPr>
         <w:t xml:space="preserve">stand.a.wirtschaft.investition</w:t>
+      </w:r>
+    </w:p>
+    <w:p>
+      <w:pPr>
+        <w:pStyle w:val="Heading1"/>
+      </w:pPr>
+      <w:r>
+        <w:t xml:space="preserve">Stände nach Position</w:t>
+      </w:r>
+    </w:p>
+    <w:p>
+      <w:pPr>
+        <w:pStyle w:val="Hinweis"/>
+      </w:pPr>
+      <w:r>
+        <w:t xml:space="preserve">Jeder Wert des Abschnitts „Je Stand“ steht auch nach der Position seines Stands bereit, gültig überall im Bericht: „stand.&lt;n&gt;.…“ zählt das Stammprojekt als 1 und die Varianten ab 2, „variante.&lt;n&gt;.…“ nur die Varianten ab 1. Fehlt die Position im Lauf, bleibt die Stelle leer mit Grund. Die Beispiele unten sind deshalb nur Text – in einer Vorlage stehen sie in doppelten geschweiften Klammern.</w:t>
+      </w:r>
+    </w:p>
+    <w:p>
+      <w:pPr>
+        <w:pStyle w:val="Hinweis"/>
+        <w:keepNext/>
+      </w:pPr>
+      <w:r>
+        <w:t xml:space="preserve">Jeder Wert je Stand außerhalb der Blöcke, nach der Position des Stands: &lt;n&gt; = 1 ist das Stammprojekt, 2, 3, … die gewählten Varianten in ihrer Reihenfolge – wie die Durchläufe von „je stand“. &lt;schluessel&gt; ist der Rest eines Schlüssels „stand.…“, etwa stand.2.anzeige oder stand.3.kennzahl.eff.jaz. Gültig überall im Bericht; fehlt die Position im Lauf, bleibt die Stelle leer mit Grund. · </w:t>
+      </w:r>
+      <w:r>
+        <w:rPr>
+          <w:noProof/>
+          <w:color w:val="7F7F7F"/>
+        </w:rPr>
+        <w:t xml:space="preserve">stand.&lt;n&gt;.&lt;schluessel&gt;</w:t>
+      </w:r>
+    </w:p>
+    <w:p>
+      <w:pPr>
+        <w:pStyle w:val="Hinweis"/>
+        <w:keepNext/>
+      </w:pPr>
+      <w:r>
+        <w:t xml:space="preserve">Jeder Wert je Stand außerhalb der Blöcke, nach der Position der Variante: &lt;n&gt; = 1, 2, … die gewählten Varianten ohne das Stammprojekt – wie die Durchläufe von „je variante“, etwa variante.1.kennzahl.eff.jaz. Gültig überall im Bericht; fehlt die Variante im Lauf, bleibt die Stelle leer mit Grund. · </w:t>
+      </w:r>
+      <w:r>
+        <w:rPr>
+          <w:noProof/>
+          <w:color w:val="7F7F7F"/>
+        </w:rPr>
+        <w:t xml:space="preserve">variante.&lt;n&gt;.&lt;schluessel&gt;</w:t>
+      </w:r>
+    </w:p>
+    <w:p>
+      <w:pPr>
+        <w:pStyle w:val="Hinweis"/>
+        <w:keepNext/>
+      </w:pPr>
+      <w:r>
+        <w:t xml:space="preserve">Stand an Position 2 (1 = Stammprojekt, dann die Varianten): Der Name des laufenden Stands im Block je Stand oder je Variante; beim Stammprojekt sein Projektname. · </w:t>
+      </w:r>
+      <w:r>
+        <w:rPr>
+          <w:noProof/>
+          <w:color w:val="7F7F7F"/>
+        </w:rPr>
+        <w:t xml:space="preserve">stand.2.anzeige</w:t>
+      </w:r>
+    </w:p>
+    <w:p>
+      <w:pPr>
+        <w:pStyle w:val="Hinweis"/>
+        <w:keepNext/>
+      </w:pPr>
+      <w:r>
+        <w:t xml:space="preserve">Variante an Position 1: Die Kennzahl „Jahresarbeitszahl (JAZ) WP“ des laufenden Stands, mit Format und Einheit des Kennzahlenkatalogs. · </w:t>
+      </w:r>
+      <w:r>
+        <w:rPr>
+          <w:noProof/>
+          <w:color w:val="7F7F7F"/>
+        </w:rPr>
+        <w:t xml:space="preserve">variante.1.kennzahl.eff.jaz</w:t>
       </w:r>
     </w:p>
     <w:p>

</xml_diff>